<commit_message>
add physical node lifecycle options and storage backup
</commit_message>
<xml_diff>
--- a/admin guide.docx
+++ b/admin guide.docx
@@ -2363,7 +2363,7 @@
           <w:b w:val="0"/>
           <w:i w:val="0"/>
         </w:rPr>
-        <w:t>Current automated test baseline: 107 passed.</w:t>
+        <w:t>Current automated test baseline: 118 passed.</w:t>
       </w:r>
     </w:p>
     <w:p>
@@ -2556,6 +2556,960 @@
           <w:sz w:val="18"/>
         </w:rPr>
         <w:t>Keep this guide with the deployment runbook.</w:t>
+      </w:r>
+    </w:p>
+    <w:p>
+      <w:r>
+        <w:br w:type="page"/>
+      </w:r>
+    </w:p>
+    <w:p>
+      <w:pPr>
+        <w:pStyle w:val="Heading1"/>
+      </w:pPr>
+      <w:r>
+        <w:rPr>
+          <w:color w:val="34495E"/>
+        </w:rPr>
+        <w:t>12. Physical node lifecycle (options 17–21)</w:t>
+      </w:r>
+    </w:p>
+    <w:p>
+      <w:r>
+        <w:t>These options apply only to kubeadm clusters. kind nodes are Docker containers and cannot be joined by physical machines. The TUI rejects physical-node actions when a kind cluster is active.</w:t>
+      </w:r>
+    </w:p>
+    <w:tbl>
+      <w:tblPr>
+        <w:tblStyle w:val="LightGrid-Accent1"/>
+        <w:tblW w:type="auto" w:w="0"/>
+        <w:tblLook w:firstColumn="1" w:firstRow="1" w:lastColumn="0" w:lastRow="0" w:noHBand="0" w:noVBand="1" w:val="04A0"/>
+      </w:tblPr>
+      <w:tblGrid>
+        <w:gridCol w:w="2520"/>
+        <w:gridCol w:w="2520"/>
+        <w:gridCol w:w="2520"/>
+        <w:gridCol w:w="2520"/>
+      </w:tblGrid>
+      <w:tr>
+        <w:tc>
+          <w:tcPr>
+            <w:tcW w:type="dxa" w:w="2520"/>
+          </w:tcPr>
+          <w:p>
+            <w:r>
+              <w:t>#</w:t>
+            </w:r>
+          </w:p>
+        </w:tc>
+        <w:tc>
+          <w:tcPr>
+            <w:tcW w:type="dxa" w:w="2520"/>
+          </w:tcPr>
+          <w:p>
+            <w:r>
+              <w:t>Choice</w:t>
+            </w:r>
+          </w:p>
+        </w:tc>
+        <w:tc>
+          <w:tcPr>
+            <w:tcW w:type="dxa" w:w="2520"/>
+          </w:tcPr>
+          <w:p>
+            <w:r>
+              <w:t>Purpose</w:t>
+            </w:r>
+          </w:p>
+        </w:tc>
+        <w:tc>
+          <w:tcPr>
+            <w:tcW w:type="dxa" w:w="2520"/>
+          </w:tcPr>
+          <w:p>
+            <w:r>
+              <w:t>Runs on</w:t>
+            </w:r>
+          </w:p>
+        </w:tc>
+      </w:tr>
+      <w:tr>
+        <w:tc>
+          <w:tcPr>
+            <w:tcW w:type="dxa" w:w="2520"/>
+          </w:tcPr>
+          <w:p>
+            <w:r>
+              <w:t>17</w:t>
+            </w:r>
+          </w:p>
+        </w:tc>
+        <w:tc>
+          <w:tcPr>
+            <w:tcW w:type="dxa" w:w="2520"/>
+          </w:tcPr>
+          <w:p>
+            <w:r>
+              <w:t>Préparer un nœud physique (CPU)</w:t>
+            </w:r>
+          </w:p>
+        </w:tc>
+        <w:tc>
+          <w:tcPr>
+            <w:tcW w:type="dxa" w:w="2520"/>
+          </w:tcPr>
+          <w:p>
+            <w:r>
+              <w:t>Install/verify containerd, kubeadm, kubelet, kubectl; swap/modules/cgroup; write node profile.</w:t>
+            </w:r>
+          </w:p>
+        </w:tc>
+        <w:tc>
+          <w:tcPr>
+            <w:tcW w:type="dxa" w:w="2520"/>
+          </w:tcPr>
+          <w:p>
+            <w:r>
+              <w:t>Target machine</w:t>
+            </w:r>
+          </w:p>
+        </w:tc>
+      </w:tr>
+      <w:tr>
+        <w:tc>
+          <w:tcPr>
+            <w:tcW w:type="dxa" w:w="2520"/>
+          </w:tcPr>
+          <w:p>
+            <w:r>
+              <w:t>18</w:t>
+            </w:r>
+          </w:p>
+        </w:tc>
+        <w:tc>
+          <w:tcPr>
+            <w:tcW w:type="dxa" w:w="2520"/>
+          </w:tcPr>
+          <w:p>
+            <w:r>
+              <w:t>Préparer un nœud physique (GPU)</w:t>
+            </w:r>
+          </w:p>
+        </w:tc>
+        <w:tc>
+          <w:tcPr>
+            <w:tcW w:type="dxa" w:w="2520"/>
+          </w:tcPr>
+          <w:p>
+            <w:r>
+              <w:t>Option 17 + NVIDIA driver/toolkit/containerd runtime. May require reboot; device plugin is cluster-level.</w:t>
+            </w:r>
+          </w:p>
+        </w:tc>
+        <w:tc>
+          <w:tcPr>
+            <w:tcW w:type="dxa" w:w="2520"/>
+          </w:tcPr>
+          <w:p>
+            <w:r>
+              <w:t>Target machine</w:t>
+            </w:r>
+          </w:p>
+        </w:tc>
+      </w:tr>
+      <w:tr>
+        <w:tc>
+          <w:tcPr>
+            <w:tcW w:type="dxa" w:w="2520"/>
+          </w:tcPr>
+          <w:p>
+            <w:r>
+              <w:t>19</w:t>
+            </w:r>
+          </w:p>
+        </w:tc>
+        <w:tc>
+          <w:tcPr>
+            <w:tcW w:type="dxa" w:w="2520"/>
+          </w:tcPr>
+          <w:p>
+            <w:r>
+              <w:t>Rejoindre le cluster (worker)</w:t>
+            </w:r>
+          </w:p>
+        </w:tc>
+        <w:tc>
+          <w:tcPr>
+            <w:tcW w:type="dxa" w:w="2520"/>
+          </w:tcPr>
+          <w:p>
+            <w:r>
+              <w:t>Paste the kubeadm join command or enter endpoint/token/CA hash; apply CPU/GPU labels.</w:t>
+            </w:r>
+          </w:p>
+        </w:tc>
+        <w:tc>
+          <w:tcPr>
+            <w:tcW w:type="dxa" w:w="2520"/>
+          </w:tcPr>
+          <w:p>
+            <w:r>
+              <w:t>Target machine</w:t>
+            </w:r>
+          </w:p>
+        </w:tc>
+      </w:tr>
+      <w:tr>
+        <w:tc>
+          <w:tcPr>
+            <w:tcW w:type="dxa" w:w="2520"/>
+          </w:tcPr>
+          <w:p>
+            <w:r>
+              <w:t>20</w:t>
+            </w:r>
+          </w:p>
+        </w:tc>
+        <w:tc>
+          <w:tcPr>
+            <w:tcW w:type="dxa" w:w="2520"/>
+          </w:tcPr>
+          <w:p>
+            <w:r>
+              <w:t>Arrêter un nœud</w:t>
+            </w:r>
+          </w:p>
+        </w:tc>
+        <w:tc>
+          <w:tcPr>
+            <w:tcW w:type="dxa" w:w="2520"/>
+          </w:tcPr>
+          <w:p>
+            <w:r>
+              <w:t>Drain/cordon from control plane or stop kubelet/containerd locally; never deletes the Node automatically.</w:t>
+            </w:r>
+          </w:p>
+        </w:tc>
+        <w:tc>
+          <w:tcPr>
+            <w:tcW w:type="dxa" w:w="2520"/>
+          </w:tcPr>
+          <w:p>
+            <w:r>
+              <w:t>Control plane or target</w:t>
+            </w:r>
+          </w:p>
+        </w:tc>
+      </w:tr>
+      <w:tr>
+        <w:tc>
+          <w:tcPr>
+            <w:tcW w:type="dxa" w:w="2520"/>
+          </w:tcPr>
+          <w:p>
+            <w:r>
+              <w:t>21</w:t>
+            </w:r>
+          </w:p>
+        </w:tc>
+        <w:tc>
+          <w:tcPr>
+            <w:tcW w:type="dxa" w:w="2520"/>
+          </w:tcPr>
+          <w:p>
+            <w:r>
+              <w:t>Rejoindre le cluster comme nœud de stockage</w:t>
+            </w:r>
+          </w:p>
+        </w:tc>
+        <w:tc>
+          <w:tcPr>
+            <w:tcW w:type="dxa" w:w="2520"/>
+          </w:tcPr>
+          <w:p>
+            <w:r>
+              <w:t>Join as worker, mount data disk, label storage; from control plane deploy backup MinIO/Velero/etcd snapshots.</w:t>
+            </w:r>
+          </w:p>
+        </w:tc>
+        <w:tc>
+          <w:tcPr>
+            <w:tcW w:type="dxa" w:w="2520"/>
+          </w:tcPr>
+          <w:p>
+            <w:r>
+              <w:t>Target + control plane</w:t>
+            </w:r>
+          </w:p>
+        </w:tc>
+      </w:tr>
+    </w:tbl>
+    <w:p/>
+    <w:p>
+      <w:pPr>
+        <w:pStyle w:val="Heading2"/>
+      </w:pPr>
+      <w:r>
+        <w:rPr>
+          <w:color w:val="E54C3F"/>
+        </w:rPr>
+        <w:t>12.1 Recommended order</w:t>
+      </w:r>
+    </w:p>
+    <w:p>
+      <w:pPr>
+        <w:pStyle w:val="ListNumber"/>
+      </w:pPr>
+      <w:r>
+        <w:t>Run option 17 or 18 on the new physical machine and reboot if requested.</w:t>
+      </w:r>
+    </w:p>
+    <w:p>
+      <w:pPr>
+        <w:pStyle w:val="ListNumber"/>
+      </w:pPr>
+      <w:r>
+        <w:t>On the control plane, print the join command: sudo kubeadm token create --print-join-command (TUI option 4 also prints it).</w:t>
+      </w:r>
+    </w:p>
+    <w:p>
+      <w:pPr>
+        <w:pStyle w:val="ListNumber"/>
+      </w:pPr>
+      <w:r>
+        <w:t>Run option 19 on the new machine and paste the full join command. Reject any command containing --control-plane.</w:t>
+      </w:r>
+    </w:p>
+    <w:p>
+      <w:pPr>
+        <w:pStyle w:val="ListNumber"/>
+      </w:pPr>
+      <w:r>
+        <w:t>On the control plane verify: kubectl get nodes -o wide and kubectl get pods -A.</w:t>
+      </w:r>
+    </w:p>
+    <w:p>
+      <w:pPr>
+        <w:pStyle w:val="ListNumber"/>
+      </w:pPr>
+      <w:r>
+        <w:t>For a GPU node: install/verify the NVIDIA device plugin, then confirm nvidia.com/gpu appears. Apply gpu=true and the gpu=true:NoSchedule taint (option 19 does this when capacity is visible).</w:t>
+      </w:r>
+    </w:p>
+    <w:p>
+      <w:pPr>
+        <w:pStyle w:val="ListNumber"/>
+      </w:pPr>
+      <w:r>
+        <w:t>For a storage node: run option 21 join mode on the machine, choose the dedicated disk and mount path, then run option 21 deploy mode on the control plane.</w:t>
+      </w:r>
+    </w:p>
+    <w:p>
+      <w:pPr>
+        <w:pStyle w:val="Heading2"/>
+      </w:pPr>
+      <w:r>
+        <w:rPr>
+          <w:color w:val="E54C3F"/>
+        </w:rPr>
+        <w:t>12.2 Node profile</w:t>
+      </w:r>
+    </w:p>
+    <w:p>
+      <w:r>
+        <w:t>Prepare writes /etc/saiep/node-profile.json (root-owned, mode 600). It contains role, gpu, storage, kube version, prepared_at and joined flags; it never contains tokens or CA hashes. Option 19 refuses to run without a prepared profile. The state file ~/.saiep/state.json remains the TUI cluster/project state, not the machine profile.</w:t>
+      </w:r>
+    </w:p>
+    <w:p>
+      <w:pPr>
+        <w:pStyle w:val="Heading2"/>
+      </w:pPr>
+      <w:r>
+        <w:rPr>
+          <w:color w:val="E54C3F"/>
+        </w:rPr>
+        <w:t>12.3 GPU preparation</w:t>
+      </w:r>
+    </w:p>
+    <w:p>
+      <w:r>
+        <w:t>Option 18 detects NVIDIA hardware, installs/verifies the driver and nvidia-container-toolkit, configures the containerd runtime and verifies nvidia-smi. A driver installation may require a reboot; after reboot re-run option 18. The NVIDIA device plugin is cluster-wide and should be installed once, not per node. A node is not labeled GPU until Kubernetes reports nvidia.com/gpu capacity.</w:t>
+      </w:r>
+    </w:p>
+    <w:p>
+      <w:pPr>
+        <w:pStyle w:val="Heading2"/>
+      </w:pPr>
+      <w:r>
+        <w:rPr>
+          <w:color w:val="E54C3F"/>
+        </w:rPr>
+        <w:t>12.4 Turning off a node</w:t>
+      </w:r>
+    </w:p>
+    <w:p>
+      <w:r>
+        <w:t>Option 20 defaults to control-plane mode: kubectl drain &lt;node&gt; --ignore-daemonsets --delete-emptydir-data --force, then cordon. It does not delete the Node object. Notebook Pods are not managed by a ReplicaSet and will not be recreated automatically; the user must restart the notebook. Local-path PVC data remains on that node. Use local mode only after the drain, to stop kubelet/containerd and optionally power off.</w:t>
+      </w:r>
+    </w:p>
+    <w:p>
+      <w:pPr>
+        <w:pStyle w:val="Heading2"/>
+      </w:pPr>
+      <w:r>
+        <w:rPr>
+          <w:color w:val="E54C3F"/>
+        </w:rPr>
+        <w:t>12.5 Storage/backup node design</w:t>
+      </w:r>
+    </w:p>
+    <w:p>
+      <w:r>
+        <w:t>The storage node joins as a normal worker and is not tainted by default, so it can also run ordinary workloads. It is labeled saiep.estin.dz/storage=true. A storage-only taint is optional and must be selected explicitly. The backup stack is NOT a replacement for the live platform MinIO.</w:t>
+      </w:r>
+    </w:p>
+    <w:p>
+      <w:r>
+        <w:rPr>
+          <w:rFonts w:ascii="Consolas" w:hAnsi="Consolas"/>
+          <w:sz w:val="18"/>
+        </w:rPr>
+        <w:t>/srv/saiep-storage/</w:t>
+        <w:br/>
+        <w:t xml:space="preserve">  minio/           dedicated backup MinIO (saiep-velero bucket)</w:t>
+        <w:br/>
+        <w:t xml:space="preserve">  etcd/            etcd snapshots</w:t>
+        <w:br/>
+        <w:t xml:space="preserve">  cluster-config/  /etc/kubernetes snapshots</w:t>
+        <w:br/>
+        <w:t xml:space="preserve">  logs/            optional shipped logs</w:t>
+        <w:br/>
+        <w:t xml:space="preserve">  restore-tests/   restore verification artifacts</w:t>
+      </w:r>
+    </w:p>
+    <w:tbl>
+      <w:tblPr>
+        <w:tblStyle w:val="LightGrid-Accent1"/>
+        <w:tblW w:type="auto" w:w="0"/>
+        <w:tblLook w:firstColumn="1" w:firstRow="1" w:lastColumn="0" w:lastRow="0" w:noHBand="0" w:noVBand="1" w:val="04A0"/>
+      </w:tblPr>
+      <w:tblGrid>
+        <w:gridCol w:w="5040"/>
+        <w:gridCol w:w="5040"/>
+      </w:tblGrid>
+      <w:tr>
+        <w:tc>
+          <w:tcPr>
+            <w:tcW w:type="dxa" w:w="5040"/>
+          </w:tcPr>
+          <w:p>
+            <w:r>
+              <w:t>Backed up</w:t>
+            </w:r>
+          </w:p>
+        </w:tc>
+        <w:tc>
+          <w:tcPr>
+            <w:tcW w:type="dxa" w:w="5040"/>
+          </w:tcPr>
+          <w:p>
+            <w:r>
+              <w:t>Method</w:t>
+            </w:r>
+          </w:p>
+        </w:tc>
+      </w:tr>
+      <w:tr>
+        <w:tc>
+          <w:tcPr>
+            <w:tcW w:type="dxa" w:w="5040"/>
+          </w:tcPr>
+          <w:p>
+            <w:r>
+              <w:t>Kubernetes objects in SAIEP/Argo namespaces</w:t>
+            </w:r>
+          </w:p>
+        </w:tc>
+        <w:tc>
+          <w:tcPr>
+            <w:tcW w:type="dxa" w:w="5040"/>
+          </w:tcPr>
+          <w:p>
+            <w:r>
+              <w:t>Velero backup</w:t>
+            </w:r>
+          </w:p>
+        </w:tc>
+      </w:tr>
+      <w:tr>
+        <w:tc>
+          <w:tcPr>
+            <w:tcW w:type="dxa" w:w="5040"/>
+          </w:tcPr>
+          <w:p>
+            <w:r>
+              <w:t>Hub PVC saiep-hub-data</w:t>
+            </w:r>
+          </w:p>
+        </w:tc>
+        <w:tc>
+          <w:tcPr>
+            <w:tcW w:type="dxa" w:w="5040"/>
+          </w:tcPr>
+          <w:p>
+            <w:r>
+              <w:t>Velero Kopia/restic (DB, cookie secret, spawn/notebook records)</w:t>
+            </w:r>
+          </w:p>
+        </w:tc>
+      </w:tr>
+      <w:tr>
+        <w:tc>
+          <w:tcPr>
+            <w:tcW w:type="dxa" w:w="5040"/>
+          </w:tcPr>
+          <w:p>
+            <w:r>
+              <w:t>Platform MinIO PVC saiep-minio-data</w:t>
+            </w:r>
+          </w:p>
+        </w:tc>
+        <w:tc>
+          <w:tcPr>
+            <w:tcW w:type="dxa" w:w="5040"/>
+          </w:tcPr>
+          <w:p>
+            <w:r>
+              <w:t>Velero Kopia/restic (artifacts + records)</w:t>
+            </w:r>
+          </w:p>
+        </w:tc>
+      </w:tr>
+      <w:tr>
+        <w:tc>
+          <w:tcPr>
+            <w:tcW w:type="dxa" w:w="5040"/>
+          </w:tcPr>
+          <w:p>
+            <w:r>
+              <w:t>User notebook PVCs saiep-nb-*</w:t>
+            </w:r>
+          </w:p>
+        </w:tc>
+        <w:tc>
+          <w:tcPr>
+            <w:tcW w:type="dxa" w:w="5040"/>
+          </w:tcPr>
+          <w:p>
+            <w:r>
+              <w:t>Velero Kopia/restic</w:t>
+            </w:r>
+          </w:p>
+        </w:tc>
+      </w:tr>
+      <w:tr>
+        <w:tc>
+          <w:tcPr>
+            <w:tcW w:type="dxa" w:w="5040"/>
+          </w:tcPr>
+          <w:p>
+            <w:r>
+              <w:t>etcd + /etc/kubernetes</w:t>
+            </w:r>
+          </w:p>
+        </w:tc>
+        <w:tc>
+          <w:tcPr>
+            <w:tcW w:type="dxa" w:w="5040"/>
+          </w:tcPr>
+          <w:p>
+            <w:r>
+              <w:t>CronJob saiep-etcd-snapshot every 6h, uploaded to backup MinIO</w:t>
+            </w:r>
+          </w:p>
+        </w:tc>
+      </w:tr>
+      <w:tr>
+        <w:tc>
+          <w:tcPr>
+            <w:tcW w:type="dxa" w:w="5040"/>
+          </w:tcPr>
+          <w:p>
+            <w:r>
+              <w:t>SAIEP/Argo logs</w:t>
+            </w:r>
+          </w:p>
+        </w:tc>
+        <w:tc>
+          <w:tcPr>
+            <w:tcW w:type="dxa" w:w="5040"/>
+          </w:tcPr>
+          <w:p>
+            <w:r>
+              <w:t>Already in platform MinIO; covered by the MinIO PVC backup</w:t>
+            </w:r>
+          </w:p>
+        </w:tc>
+      </w:tr>
+      <w:tr>
+        <w:tc>
+          <w:tcPr>
+            <w:tcW w:type="dxa" w:w="5040"/>
+          </w:tcPr>
+          <w:p>
+            <w:r>
+              <w:t>Node journals / raw /var/log</w:t>
+            </w:r>
+          </w:p>
+        </w:tc>
+        <w:tc>
+          <w:tcPr>
+            <w:tcW w:type="dxa" w:w="5040"/>
+          </w:tcPr>
+          <w:p>
+            <w:r>
+              <w:t>Not included by default; add a log shipper if required</w:t>
+            </w:r>
+          </w:p>
+        </w:tc>
+      </w:tr>
+    </w:tbl>
+    <w:p/>
+    <w:p>
+      <w:r>
+        <w:t>Velero schedule: daily at 02:00, 30-day TTL, all namespaces except kube-system, velero and saiep-backup. The backup MinIO, Velero repository and etcd snapshots live on one machine: this is a single point of failure, not HA. Add a second off-node copy for production.</w:t>
+      </w:r>
+    </w:p>
+    <w:p>
+      <w:pPr>
+        <w:pStyle w:val="Heading2"/>
+      </w:pPr>
+      <w:r>
+        <w:rPr>
+          <w:color w:val="E54C3F"/>
+        </w:rPr>
+        <w:t>12.6 Restore verification</w:t>
+      </w:r>
+    </w:p>
+    <w:p>
+      <w:pPr>
+        <w:pStyle w:val="ListNumber"/>
+      </w:pPr>
+      <w:r>
+        <w:t>Create a canary PVC with a known checksum, back it up with Velero, delete it, restore it and compare the checksum.</w:t>
+      </w:r>
+    </w:p>
+    <w:p>
+      <w:pPr>
+        <w:pStyle w:val="ListNumber"/>
+      </w:pPr>
+      <w:r>
+        <w:t>Restore the Hub PVC into a test namespace and run sqlite3 jupyterhub.sqlite "PRAGMA integrity_check;".</w:t>
+      </w:r>
+    </w:p>
+    <w:p>
+      <w:pPr>
+        <w:pStyle w:val="ListNumber"/>
+      </w:pPr>
+      <w:r>
+        <w:t>Run etcdctl snapshot status on the latest snapshot.</w:t>
+      </w:r>
+    </w:p>
+    <w:p>
+      <w:pPr>
+        <w:pStyle w:val="ListNumber"/>
+      </w:pPr>
+      <w:r>
+        <w:t>Restore the etcd snapshot in a disposable etcd/cluster and record the result.</w:t>
+      </w:r>
+    </w:p>
+    <w:p>
+      <w:pPr>
+        <w:pStyle w:val="ListNumber"/>
+      </w:pPr>
+      <w:r>
+        <w:t>Store the test timestamp/result in /srv/saiep-storage/restore-tests/.</w:t>
+      </w:r>
+    </w:p>
+    <w:p>
+      <w:pPr>
+        <w:pStyle w:val="Heading2"/>
+      </w:pPr>
+      <w:r>
+        <w:rPr>
+          <w:color w:val="E54C3F"/>
+        </w:rPr>
+        <w:t>12.7 Troubleshooting physical nodes</w:t>
+      </w:r>
+    </w:p>
+    <w:tbl>
+      <w:tblPr>
+        <w:tblStyle w:val="LightGrid-Accent1"/>
+        <w:tblW w:type="auto" w:w="0"/>
+        <w:tblLook w:firstColumn="1" w:firstRow="1" w:lastColumn="0" w:lastRow="0" w:noHBand="0" w:noVBand="1" w:val="04A0"/>
+      </w:tblPr>
+      <w:tblGrid>
+        <w:gridCol w:w="5040"/>
+        <w:gridCol w:w="5040"/>
+      </w:tblGrid>
+      <w:tr>
+        <w:tc>
+          <w:tcPr>
+            <w:tcW w:type="dxa" w:w="5040"/>
+          </w:tcPr>
+          <w:p>
+            <w:r>
+              <w:t>Symptom</w:t>
+            </w:r>
+          </w:p>
+        </w:tc>
+        <w:tc>
+          <w:tcPr>
+            <w:tcW w:type="dxa" w:w="5040"/>
+          </w:tcPr>
+          <w:p>
+            <w:r>
+              <w:t>Checks / fix</w:t>
+            </w:r>
+          </w:p>
+        </w:tc>
+      </w:tr>
+      <w:tr>
+        <w:tc>
+          <w:tcPr>
+            <w:tcW w:type="dxa" w:w="5040"/>
+          </w:tcPr>
+          <w:p>
+            <w:r>
+              <w:t>Option 17/18 refuses because kind is active</w:t>
+            </w:r>
+          </w:p>
+        </w:tc>
+        <w:tc>
+          <w:tcPr>
+            <w:tcW w:type="dxa" w:w="5040"/>
+          </w:tcPr>
+          <w:p>
+            <w:r>
+              <w:t>Use a kubeadm cluster. Physical machines cannot join kind.</w:t>
+            </w:r>
+          </w:p>
+        </w:tc>
+      </w:tr>
+      <w:tr>
+        <w:tc>
+          <w:tcPr>
+            <w:tcW w:type="dxa" w:w="5040"/>
+          </w:tcPr>
+          <w:p>
+            <w:r>
+              <w:t>kubeadm join: token expired</w:t>
+            </w:r>
+          </w:p>
+        </w:tc>
+        <w:tc>
+          <w:tcPr>
+            <w:tcW w:type="dxa" w:w="5040"/>
+          </w:tcPr>
+          <w:p>
+            <w:r>
+              <w:t>On control plane: sudo kubeadm token create --print-join-command.</w:t>
+            </w:r>
+          </w:p>
+        </w:tc>
+      </w:tr>
+      <w:tr>
+        <w:tc>
+          <w:tcPr>
+            <w:tcW w:type="dxa" w:w="5040"/>
+          </w:tcPr>
+          <w:p>
+            <w:r>
+              <w:t>Node NotReady after join</w:t>
+            </w:r>
+          </w:p>
+        </w:tc>
+        <w:tc>
+          <w:tcPr>
+            <w:tcW w:type="dxa" w:w="5040"/>
+          </w:tcPr>
+          <w:p>
+            <w:r>
+              <w:t>kubectl get pods -A; check Calico/Cilium DaemonSet; sudo journalctl -u kubelet -n 100.</w:t>
+            </w:r>
+          </w:p>
+        </w:tc>
+      </w:tr>
+      <w:tr>
+        <w:tc>
+          <w:tcPr>
+            <w:tcW w:type="dxa" w:w="5040"/>
+          </w:tcPr>
+          <w:p>
+            <w:r>
+              <w:t>GPU node has no nvidia.com/gpu</w:t>
+            </w:r>
+          </w:p>
+        </w:tc>
+        <w:tc>
+          <w:tcPr>
+            <w:tcW w:type="dxa" w:w="5040"/>
+          </w:tcPr>
+          <w:p>
+            <w:r>
+              <w:t>Install/verify NVIDIA driver, nvidia-container-toolkit, containerd runtime and device plugin; restart containerd/kubelet.</w:t>
+            </w:r>
+          </w:p>
+        </w:tc>
+      </w:tr>
+      <w:tr>
+        <w:tc>
+          <w:tcPr>
+            <w:tcW w:type="dxa" w:w="5040"/>
+          </w:tcPr>
+          <w:p>
+            <w:r>
+              <w:t>GPU labels missing</w:t>
+            </w:r>
+          </w:p>
+        </w:tc>
+        <w:tc>
+          <w:tcPr>
+            <w:tcW w:type="dxa" w:w="5040"/>
+          </w:tcPr>
+          <w:p>
+            <w:r>
+              <w:t>Run option 19 on a node with kubectl access, or run the printed kubectl label/taint commands on the control plane.</w:t>
+            </w:r>
+          </w:p>
+        </w:tc>
+      </w:tr>
+      <w:tr>
+        <w:tc>
+          <w:tcPr>
+            <w:tcW w:type="dxa" w:w="5040"/>
+          </w:tcPr>
+          <w:p>
+            <w:r>
+              <w:t>Backup MinIO not scheduled</w:t>
+            </w:r>
+          </w:p>
+        </w:tc>
+        <w:tc>
+          <w:tcPr>
+            <w:tcW w:type="dxa" w:w="5040"/>
+          </w:tcPr>
+          <w:p>
+            <w:r>
+              <w:t>Check node label saiep.estin.dz/storage=true, taint/toleration if storage-only, and kubectl -n saiep-backup describe pod.</w:t>
+            </w:r>
+          </w:p>
+        </w:tc>
+      </w:tr>
+      <w:tr>
+        <w:tc>
+          <w:tcPr>
+            <w:tcW w:type="dxa" w:w="5040"/>
+          </w:tcPr>
+          <w:p>
+            <w:r>
+              <w:t>Velero backup fails</w:t>
+            </w:r>
+          </w:p>
+        </w:tc>
+        <w:tc>
+          <w:tcPr>
+            <w:tcW w:type="dxa" w:w="5040"/>
+          </w:tcPr>
+          <w:p>
+            <w:r>
+              <w:t>Check backupStorageLocation, backup MinIO credentials and that saiep-velero bucket exists.</w:t>
+            </w:r>
+          </w:p>
+        </w:tc>
+      </w:tr>
+      <w:tr>
+        <w:tc>
+          <w:tcPr>
+            <w:tcW w:type="dxa" w:w="5040"/>
+          </w:tcPr>
+          <w:p>
+            <w:r>
+              <w:t>etcd snapshot CronJob fails</w:t>
+            </w:r>
+          </w:p>
+        </w:tc>
+        <w:tc>
+          <w:tcPr>
+            <w:tcW w:type="dxa" w:w="5040"/>
+          </w:tcPr>
+          <w:p>
+            <w:r>
+              <w:t>Check control-plane nodeSelector/toleration, hostPath /etc/kubernetes, etcd certs and hostNetwork.</w:t>
+            </w:r>
+          </w:p>
+        </w:tc>
+      </w:tr>
+      <w:tr>
+        <w:tc>
+          <w:tcPr>
+            <w:tcW w:type="dxa" w:w="5040"/>
+          </w:tcPr>
+          <w:p>
+            <w:r>
+              <w:t>Storage node is also a worker</w:t>
+            </w:r>
+          </w:p>
+        </w:tc>
+        <w:tc>
+          <w:tcPr>
+            <w:tcW w:type="dxa" w:w="5040"/>
+          </w:tcPr>
+          <w:p>
+            <w:r>
+              <w:t>Do not add the storage-only taint unless intended; backup pods already tolerate it.</w:t>
+            </w:r>
+          </w:p>
+        </w:tc>
+      </w:tr>
+      <w:tr>
+        <w:tc>
+          <w:tcPr>
+            <w:tcW w:type="dxa" w:w="5040"/>
+          </w:tcPr>
+          <w:p>
+            <w:r>
+              <w:t>Replacing a worker with local-path PVCs</w:t>
+            </w:r>
+          </w:p>
+        </w:tc>
+        <w:tc>
+          <w:tcPr>
+            <w:tcW w:type="dxa" w:w="5040"/>
+          </w:tcPr>
+          <w:p>
+            <w:r>
+              <w:t>Back up/migrate the PVC first; local-path data does not move with the Node.</w:t>
+            </w:r>
+          </w:p>
+        </w:tc>
+      </w:tr>
+    </w:tbl>
+    <w:p/>
+    <w:p>
+      <w:pPr>
+        <w:pStyle w:val="Heading2"/>
+      </w:pPr>
+      <w:r>
+        <w:rPr>
+          <w:color w:val="E54C3F"/>
+        </w:rPr>
+        <w:t>12.8 Out of scope</w:t>
+      </w:r>
+    </w:p>
+    <w:p>
+      <w:r>
+        <w:t>Adding/replacing control planes and HA/etcd redesign are out of scope. The current kubeadm init is single-control-plane and does not use --control-plane-endpoint or --upload-certs; replacing that control plane requires a backup/restore or a migration to HA.</w:t>
       </w:r>
     </w:p>
     <w:sectPr>

</xml_diff>